<commit_message>
To Set Four User Type(ROOT, IT_ADMIN, IT_PERSONNEL,GENERAL_USER)
</commit_message>
<xml_diff>
--- a/document/task-18-August.docx
+++ b/document/task-18-August.docx
@@ -3043,6 +3043,1387 @@
                     <a:xfrm>
                       <a:off x="0" y="0"/>
                       <a:ext cx="5943600" cy="3178175"/>
+                    </a:xfrm>
+                    <a:prstGeom prst="rect">
+                      <a:avLst/>
+                    </a:prstGeom>
+                  </pic:spPr>
+                </pic:pic>
+              </a:graphicData>
+            </a:graphic>
+          </wp:inline>
+        </w:drawing>
+      </w:r>
+    </w:p>
+    <w:p/>
+    <w:p/>
+    <w:p/>
+    <w:p/>
+    <w:p>
+      <w:r>
+        <w:t>next step to forward step by step with page name</w:t>
+      </w:r>
+    </w:p>
+    <w:p>
+      <w:r>
+        <w:t>Great — your current four authentication files are now in a good state:</w:t>
+      </w:r>
+    </w:p>
+    <w:p>
+      <w:pPr>
+        <w:numPr>
+          <w:ilvl w:val="0"/>
+          <w:numId w:val="2"/>
+        </w:numPr>
+      </w:pPr>
+      <w:r>
+        <w:t xml:space="preserve">frontend/lib/api.ts → /auth/me, permission helpers, logout storage handling are ready. </w:t>
+      </w:r>
+    </w:p>
+    <w:p>
+      <w:pPr>
+        <w:numPr>
+          <w:ilvl w:val="0"/>
+          <w:numId w:val="2"/>
+        </w:numPr>
+      </w:pPr>
+      <w:r>
+        <w:t xml:space="preserve">frontend/app/auth/page.tsx → login now loads the authoritative /auth/me profile. </w:t>
+      </w:r>
+    </w:p>
+    <w:p>
+      <w:pPr>
+        <w:numPr>
+          <w:ilvl w:val="0"/>
+          <w:numId w:val="2"/>
+        </w:numPr>
+      </w:pPr>
+      <w:r>
+        <w:t xml:space="preserve">frontend/app/dashboard/layout.tsx → dashboard session validation is active. </w:t>
+      </w:r>
+    </w:p>
+    <w:p>
+      <w:pPr>
+        <w:numPr>
+          <w:ilvl w:val="0"/>
+          <w:numId w:val="2"/>
+        </w:numPr>
+      </w:pPr>
+      <w:r>
+        <w:t xml:space="preserve">frontend/components/ui/header.tsx → logout now clears authentication first and works smoothly. </w:t>
+      </w:r>
+    </w:p>
+    <w:p>
+      <w:r>
+        <w:t>Now continue in this exact order.</w:t>
+      </w:r>
+    </w:p>
+    <w:p>
+      <w:pPr>
+        <w:rPr>
+          <w:b/>
+          <w:bCs/>
+        </w:rPr>
+      </w:pPr>
+      <w:r>
+        <w:rPr>
+          <w:b/>
+          <w:bCs/>
+        </w:rPr>
+        <w:t>Step 1 — Sidebar permission control</w:t>
+      </w:r>
+    </w:p>
+    <w:p>
+      <w:pPr>
+        <w:rPr>
+          <w:b/>
+          <w:bCs/>
+        </w:rPr>
+      </w:pPr>
+      <w:r>
+        <w:rPr>
+          <w:b/>
+          <w:bCs/>
+        </w:rPr>
+        <w:t>Page</w:t>
+      </w:r>
+    </w:p>
+    <w:p>
+      <w:r>
+        <w:t>frontend/components/ui/sidebar.tsx</w:t>
+      </w:r>
+    </w:p>
+    <w:p>
+      <w:r>
+        <w:t xml:space="preserve">This is the </w:t>
+      </w:r>
+      <w:r>
+        <w:rPr>
+          <w:b/>
+          <w:bCs/>
+        </w:rPr>
+        <w:t>next file to update</w:t>
+      </w:r>
+      <w:r>
+        <w:t>.</w:t>
+      </w:r>
+    </w:p>
+    <w:p>
+      <w:r>
+        <w:lastRenderedPageBreak/>
+        <w:t>Goal:</w:t>
+      </w:r>
+    </w:p>
+    <w:p>
+      <w:r>
+        <w:t>ROOT</w:t>
+      </w:r>
+    </w:p>
+    <w:p>
+      <w:r>
+        <w:t xml:space="preserve">  User menus </w:t>
+      </w:r>
+      <w:r>
+        <w:rPr>
+          <w:rFonts w:ascii="Segoe UI Emoji" w:hAnsi="Segoe UI Emoji" w:cs="Segoe UI Emoji"/>
+        </w:rPr>
+        <w:t>✅</w:t>
+      </w:r>
+    </w:p>
+    <w:p>
+      <w:r>
+        <w:t xml:space="preserve">  Admin menus </w:t>
+      </w:r>
+      <w:r>
+        <w:rPr>
+          <w:rFonts w:ascii="Segoe UI Emoji" w:hAnsi="Segoe UI Emoji" w:cs="Segoe UI Emoji"/>
+        </w:rPr>
+        <w:t>✅</w:t>
+      </w:r>
+    </w:p>
+    <w:p/>
+    <w:p>
+      <w:r>
+        <w:t>IT_ADMIN</w:t>
+      </w:r>
+    </w:p>
+    <w:p>
+      <w:r>
+        <w:t xml:space="preserve">  User menus </w:t>
+      </w:r>
+      <w:r>
+        <w:rPr>
+          <w:rFonts w:ascii="Segoe UI Emoji" w:hAnsi="Segoe UI Emoji" w:cs="Segoe UI Emoji"/>
+        </w:rPr>
+        <w:t>✅</w:t>
+      </w:r>
+    </w:p>
+    <w:p>
+      <w:r>
+        <w:t xml:space="preserve">  Admin menus </w:t>
+      </w:r>
+      <w:r>
+        <w:rPr>
+          <w:rFonts w:ascii="Segoe UI Emoji" w:hAnsi="Segoe UI Emoji" w:cs="Segoe UI Emoji"/>
+        </w:rPr>
+        <w:t>✅</w:t>
+      </w:r>
+    </w:p>
+    <w:p/>
+    <w:p>
+      <w:r>
+        <w:t>IT_PERSONNEL</w:t>
+      </w:r>
+    </w:p>
+    <w:p>
+      <w:r>
+        <w:t xml:space="preserve">  User menus </w:t>
+      </w:r>
+      <w:r>
+        <w:rPr>
+          <w:rFonts w:ascii="Segoe UI Emoji" w:hAnsi="Segoe UI Emoji" w:cs="Segoe UI Emoji"/>
+        </w:rPr>
+        <w:t>✅</w:t>
+      </w:r>
+    </w:p>
+    <w:p>
+      <w:r>
+        <w:t xml:space="preserve">  Admin menus </w:t>
+      </w:r>
+      <w:r>
+        <w:rPr>
+          <w:rFonts w:ascii="Segoe UI Emoji" w:hAnsi="Segoe UI Emoji" w:cs="Segoe UI Emoji"/>
+        </w:rPr>
+        <w:t>❌</w:t>
+      </w:r>
+    </w:p>
+    <w:p/>
+    <w:p>
+      <w:r>
+        <w:t>GENERAL_USER</w:t>
+      </w:r>
+    </w:p>
+    <w:p>
+      <w:r>
+        <w:t xml:space="preserve">  User menus </w:t>
+      </w:r>
+      <w:r>
+        <w:rPr>
+          <w:rFonts w:ascii="Segoe UI Emoji" w:hAnsi="Segoe UI Emoji" w:cs="Segoe UI Emoji"/>
+        </w:rPr>
+        <w:t>✅</w:t>
+      </w:r>
+    </w:p>
+    <w:p>
+      <w:r>
+        <w:t xml:space="preserve">  Admin menus </w:t>
+      </w:r>
+      <w:r>
+        <w:rPr>
+          <w:rFonts w:ascii="Segoe UI Emoji" w:hAnsi="Segoe UI Emoji" w:cs="Segoe UI Emoji"/>
+        </w:rPr>
+        <w:t>❌</w:t>
+      </w:r>
+    </w:p>
+    <w:p>
+      <w:r>
+        <w:t>We will use:</w:t>
+      </w:r>
+    </w:p>
+    <w:p>
+      <w:r>
+        <w:t>panel.admin.access</w:t>
+      </w:r>
+    </w:p>
+    <w:p>
+      <w:r>
+        <w:t>panel.user.access</w:t>
+      </w:r>
+    </w:p>
+    <w:p>
+      <w:r>
+        <w:t>not user_type.</w:t>
+      </w:r>
+    </w:p>
+    <w:p>
+      <w:r>
+        <w:t>First back it up:</w:t>
+      </w:r>
+    </w:p>
+    <w:p>
+      <w:r>
+        <w:t>cd D:\ITM-Data\itm</w:t>
+      </w:r>
+    </w:p>
+    <w:p/>
+    <w:p>
+      <w:r>
+        <w:t>Copy-Item `</w:t>
+      </w:r>
+    </w:p>
+    <w:p>
+      <w:r>
+        <w:t xml:space="preserve">    ".\frontend\components\ui\sidebar.tsx" `</w:t>
+      </w:r>
+    </w:p>
+    <w:p>
+      <w:r>
+        <w:lastRenderedPageBreak/>
+        <w:t xml:space="preserve">    ".\frontend\components\ui\sidebar.tsx.before-auth-permissions"</w:t>
+      </w:r>
+    </w:p>
+    <w:p>
+      <w:r>
+        <w:t>Then send me the complete current file:</w:t>
+      </w:r>
+    </w:p>
+    <w:p>
+      <w:r>
+        <w:t>Get-Content ".\frontend\components\ui\sidebar.tsx"</w:t>
+      </w:r>
+    </w:p>
+    <w:p>
+      <w:r>
+        <w:t xml:space="preserve">Your search confirms this is the active sidebar and that the current Admin menu begins around the same file area as Add All Item, Master Data, Lifecycle Actions, and Reports. </w:t>
+      </w:r>
+    </w:p>
+    <w:p>
+      <w:r>
+        <w:rPr>
+          <w:b/>
+          <w:bCs/>
+        </w:rPr>
+        <w:t>Do not change it yourself yet.</w:t>
+      </w:r>
+      <w:r>
+        <w:t xml:space="preserve"> I will give you the complete updated sidebar.tsx.</w:t>
+      </w:r>
+    </w:p>
+    <w:p>
+      <w:r>
+        <w:pict w14:anchorId="48290EA8">
+          <v:rect id="_x0000_i1083" style="width:0;height:1.5pt" o:hralign="center" o:hrstd="t" o:hr="t" fillcolor="#a0a0a0" stroked="f"/>
+        </w:pict>
+      </w:r>
+    </w:p>
+    <w:p>
+      <w:pPr>
+        <w:rPr>
+          <w:b/>
+          <w:bCs/>
+        </w:rPr>
+      </w:pPr>
+      <w:r>
+        <w:rPr>
+          <w:b/>
+          <w:bCs/>
+        </w:rPr>
+        <w:t>Step 2 — Requisition Approval/Delivery UI permissions</w:t>
+      </w:r>
+    </w:p>
+    <w:p>
+      <w:pPr>
+        <w:rPr>
+          <w:b/>
+          <w:bCs/>
+        </w:rPr>
+      </w:pPr>
+      <w:r>
+        <w:rPr>
+          <w:b/>
+          <w:bCs/>
+        </w:rPr>
+        <w:t>Page</w:t>
+      </w:r>
+    </w:p>
+    <w:p>
+      <w:r>
+        <w:t>frontend/app/dashboard/requisitions/page.tsx</w:t>
+      </w:r>
+    </w:p>
+    <w:p>
+      <w:r>
+        <w:t>After Sidebar passes, this becomes the next file.</w:t>
+      </w:r>
+    </w:p>
+    <w:p>
+      <w:r>
+        <w:t>Goal:</w:t>
+      </w:r>
+    </w:p>
+    <w:p>
+      <w:r>
+        <w:t>ROOT</w:t>
+      </w:r>
+    </w:p>
+    <w:p>
+      <w:r>
+        <w:t xml:space="preserve">Approval dropdown </w:t>
+      </w:r>
+      <w:r>
+        <w:rPr>
+          <w:rFonts w:ascii="Segoe UI Emoji" w:hAnsi="Segoe UI Emoji" w:cs="Segoe UI Emoji"/>
+        </w:rPr>
+        <w:t>✅</w:t>
+      </w:r>
+    </w:p>
+    <w:p>
+      <w:r>
+        <w:t xml:space="preserve">Delivery dropdown </w:t>
+      </w:r>
+      <w:r>
+        <w:rPr>
+          <w:rFonts w:ascii="Segoe UI Emoji" w:hAnsi="Segoe UI Emoji" w:cs="Segoe UI Emoji"/>
+        </w:rPr>
+        <w:t>✅</w:t>
+      </w:r>
+    </w:p>
+    <w:p/>
+    <w:p>
+      <w:r>
+        <w:t>IT_ADMIN</w:t>
+      </w:r>
+    </w:p>
+    <w:p>
+      <w:r>
+        <w:t xml:space="preserve">Approval dropdown </w:t>
+      </w:r>
+      <w:r>
+        <w:rPr>
+          <w:rFonts w:ascii="Segoe UI Emoji" w:hAnsi="Segoe UI Emoji" w:cs="Segoe UI Emoji"/>
+        </w:rPr>
+        <w:t>✅</w:t>
+      </w:r>
+    </w:p>
+    <w:p>
+      <w:r>
+        <w:t xml:space="preserve">Delivery dropdown </w:t>
+      </w:r>
+      <w:r>
+        <w:rPr>
+          <w:rFonts w:ascii="Segoe UI Emoji" w:hAnsi="Segoe UI Emoji" w:cs="Segoe UI Emoji"/>
+        </w:rPr>
+        <w:t>✅</w:t>
+      </w:r>
+    </w:p>
+    <w:p/>
+    <w:p>
+      <w:r>
+        <w:t>IT_PERSONNEL</w:t>
+      </w:r>
+    </w:p>
+    <w:p>
+      <w:r>
+        <w:t xml:space="preserve">Approval dropdown </w:t>
+      </w:r>
+      <w:r>
+        <w:rPr>
+          <w:rFonts w:ascii="Segoe UI Emoji" w:hAnsi="Segoe UI Emoji" w:cs="Segoe UI Emoji"/>
+        </w:rPr>
+        <w:t>✅</w:t>
+      </w:r>
+    </w:p>
+    <w:p>
+      <w:r>
+        <w:t xml:space="preserve">Delivery dropdown </w:t>
+      </w:r>
+      <w:r>
+        <w:rPr>
+          <w:rFonts w:ascii="Segoe UI Emoji" w:hAnsi="Segoe UI Emoji" w:cs="Segoe UI Emoji"/>
+        </w:rPr>
+        <w:t>✅</w:t>
+      </w:r>
+    </w:p>
+    <w:p/>
+    <w:p>
+      <w:r>
+        <w:t>GENERAL_USER</w:t>
+      </w:r>
+    </w:p>
+    <w:p>
+      <w:r>
+        <w:t xml:space="preserve">Approval dropdown </w:t>
+      </w:r>
+      <w:r>
+        <w:rPr>
+          <w:rFonts w:ascii="Segoe UI Emoji" w:hAnsi="Segoe UI Emoji" w:cs="Segoe UI Emoji"/>
+        </w:rPr>
+        <w:t>❌</w:t>
+      </w:r>
+    </w:p>
+    <w:p>
+      <w:r>
+        <w:lastRenderedPageBreak/>
+        <w:t xml:space="preserve">Delivery dropdown </w:t>
+      </w:r>
+      <w:r>
+        <w:rPr>
+          <w:rFonts w:ascii="Segoe UI Emoji" w:hAnsi="Segoe UI Emoji" w:cs="Segoe UI Emoji"/>
+        </w:rPr>
+        <w:t>❌</w:t>
+      </w:r>
+    </w:p>
+    <w:p>
+      <w:r>
+        <w:t>We already have these helpers in api.ts:</w:t>
+      </w:r>
+    </w:p>
+    <w:p>
+      <w:r>
+        <w:t>canApproveRequisition(user)</w:t>
+      </w:r>
+    </w:p>
+    <w:p>
+      <w:r>
+        <w:t>canDeliverRequisition(user)</w:t>
+      </w:r>
+    </w:p>
+    <w:p>
+      <w:r>
+        <w:t>So this page will not contain role-number logic such as:</w:t>
+      </w:r>
+    </w:p>
+    <w:p>
+      <w:r>
+        <w:t>user_type === 1</w:t>
+      </w:r>
+    </w:p>
+    <w:p>
+      <w:r>
+        <w:t>It will use permissions.</w:t>
+      </w:r>
+    </w:p>
+    <w:p>
+      <w:r>
+        <w:t>Backend 403 stays permanently as the real security layer.</w:t>
+      </w:r>
+    </w:p>
+    <w:p>
+      <w:r>
+        <w:t>After Sidebar is complete, send:</w:t>
+      </w:r>
+    </w:p>
+    <w:p>
+      <w:r>
+        <w:t>Get-Content ".\frontend\app\dashboard\requisitions\page.tsx"</w:t>
+      </w:r>
+    </w:p>
+    <w:p>
+      <w:r>
+        <w:pict w14:anchorId="6A242C14">
+          <v:rect id="_x0000_i1084" style="width:0;height:1.5pt" o:hralign="center" o:hrstd="t" o:hr="t" fillcolor="#a0a0a0" stroked="f"/>
+        </w:pict>
+      </w:r>
+    </w:p>
+    <w:p>
+      <w:pPr>
+        <w:rPr>
+          <w:b/>
+          <w:bCs/>
+        </w:rPr>
+      </w:pPr>
+      <w:r>
+        <w:rPr>
+          <w:b/>
+          <w:bCs/>
+        </w:rPr>
+        <w:t>Step 3 — Header logged-in user information</w:t>
+      </w:r>
+    </w:p>
+    <w:p>
+      <w:pPr>
+        <w:rPr>
+          <w:b/>
+          <w:bCs/>
+        </w:rPr>
+      </w:pPr>
+      <w:r>
+        <w:rPr>
+          <w:b/>
+          <w:bCs/>
+        </w:rPr>
+        <w:t>Page</w:t>
+      </w:r>
+    </w:p>
+    <w:p>
+      <w:r>
+        <w:t>frontend/components/ui/header.tsx</w:t>
+      </w:r>
+    </w:p>
+    <w:p>
+      <w:r>
+        <w:t>Logout is already fixed, but the current header still defaults to hard-coded values:</w:t>
+      </w:r>
+    </w:p>
+    <w:p>
+      <w:r>
+        <w:t>Muhsina Akter</w:t>
+      </w:r>
+    </w:p>
+    <w:p>
+      <w:r>
+        <w:t>muhsina.akter@fiberathome.net</w:t>
+      </w:r>
+    </w:p>
+    <w:p>
+      <w:r>
+        <w:t>MA</w:t>
+      </w:r>
+    </w:p>
+    <w:p>
+      <w:r>
+        <w:t>Later we will replace those with /auth/me values:</w:t>
+      </w:r>
+    </w:p>
+    <w:p>
+      <w:r>
+        <w:t>full_name</w:t>
+      </w:r>
+    </w:p>
+    <w:p>
+      <w:r>
+        <w:t>email</w:t>
+      </w:r>
+    </w:p>
+    <w:p>
+      <w:r>
+        <w:t>role_name</w:t>
+      </w:r>
+    </w:p>
+    <w:p>
+      <w:r>
+        <w:t>employee_id</w:t>
+      </w:r>
+    </w:p>
+    <w:p>
+      <w:r>
+        <w:t>For example, IT Personnel would automatically show:</w:t>
+      </w:r>
+    </w:p>
+    <w:p>
+      <w:r>
+        <w:t>Test IT Personnel</w:t>
+      </w:r>
+    </w:p>
+    <w:p>
+      <w:r>
+        <w:t>TEST-IT-001</w:t>
+      </w:r>
+    </w:p>
+    <w:p>
+      <w:r>
+        <w:lastRenderedPageBreak/>
+        <w:t>IT Personnel</w:t>
+      </w:r>
+    </w:p>
+    <w:p>
+      <w:r>
+        <w:t>No separate login lookup will be required because itm_user already contains this information.</w:t>
+      </w:r>
+    </w:p>
+    <w:p>
+      <w:r>
+        <w:pict w14:anchorId="08BBEE6F">
+          <v:rect id="_x0000_i1085" style="width:0;height:1.5pt" o:hralign="center" o:hrstd="t" o:hr="t" fillcolor="#a0a0a0" stroked="f"/>
+        </w:pict>
+      </w:r>
+    </w:p>
+    <w:p>
+      <w:pPr>
+        <w:rPr>
+          <w:b/>
+          <w:bCs/>
+        </w:rPr>
+      </w:pPr>
+      <w:r>
+        <w:rPr>
+          <w:b/>
+          <w:bCs/>
+        </w:rPr>
+        <w:t>Step 4 — Sidebar logged-in user information</w:t>
+      </w:r>
+    </w:p>
+    <w:p>
+      <w:pPr>
+        <w:rPr>
+          <w:b/>
+          <w:bCs/>
+        </w:rPr>
+      </w:pPr>
+      <w:r>
+        <w:rPr>
+          <w:b/>
+          <w:bCs/>
+        </w:rPr>
+        <w:t>Page</w:t>
+      </w:r>
+    </w:p>
+    <w:p>
+      <w:r>
+        <w:t>frontend/components/ui/sidebar.tsx</w:t>
+      </w:r>
+    </w:p>
+    <w:p>
+      <w:r>
+        <w:t>Your current sidebar also appears to have static user information near the bottom.</w:t>
+      </w:r>
+    </w:p>
+    <w:p>
+      <w:r>
+        <w:t>We will replace that in the same sidebar update using:</w:t>
+      </w:r>
+    </w:p>
+    <w:p>
+      <w:r>
+        <w:t>currentUser.full_name</w:t>
+      </w:r>
+    </w:p>
+    <w:p>
+      <w:r>
+        <w:t>currentUser.employee_id</w:t>
+      </w:r>
+    </w:p>
+    <w:p>
+      <w:r>
+        <w:t>currentUser.role_name</w:t>
+      </w:r>
+    </w:p>
+    <w:p>
+      <w:r>
+        <w:t>So the logged-in user's actual identity is shown everywhere consistently.</w:t>
+      </w:r>
+    </w:p>
+    <w:p>
+      <w:r>
+        <w:pict w14:anchorId="2CB6D2C5">
+          <v:rect id="_x0000_i1086" style="width:0;height:1.5pt" o:hralign="center" o:hrstd="t" o:hr="t" fillcolor="#a0a0a0" stroked="f"/>
+        </w:pict>
+      </w:r>
+    </w:p>
+    <w:p>
+      <w:pPr>
+        <w:rPr>
+          <w:b/>
+          <w:bCs/>
+        </w:rPr>
+      </w:pPr>
+      <w:r>
+        <w:rPr>
+          <w:b/>
+          <w:bCs/>
+        </w:rPr>
+        <w:t>Step 5 — Test all four accounts</w:t>
+      </w:r>
+    </w:p>
+    <w:p>
+      <w:r>
+        <w:t>After Sidebar + Requisition permission changes:</w:t>
+      </w:r>
+    </w:p>
+    <w:p>
+      <w:pPr>
+        <w:rPr>
+          <w:b/>
+          <w:bCs/>
+        </w:rPr>
+      </w:pPr>
+      <w:r>
+        <w:rPr>
+          <w:b/>
+          <w:bCs/>
+        </w:rPr>
+        <w:t>ROOT</w:t>
+      </w:r>
+    </w:p>
+    <w:p>
+      <w:r>
+        <w:t>Login:</w:t>
+      </w:r>
+    </w:p>
+    <w:p>
+      <w:r>
+        <w:t>itm.root</w:t>
+      </w:r>
+    </w:p>
+    <w:p>
+      <w:r>
+        <w:t>Expected:</w:t>
+      </w:r>
+    </w:p>
+    <w:p>
+      <w:r>
+        <w:t xml:space="preserve">Admin menu       </w:t>
+      </w:r>
+      <w:r>
+        <w:rPr>
+          <w:rFonts w:ascii="Segoe UI Emoji" w:hAnsi="Segoe UI Emoji" w:cs="Segoe UI Emoji"/>
+        </w:rPr>
+        <w:t>✅</w:t>
+      </w:r>
+    </w:p>
+    <w:p>
+      <w:r>
+        <w:t xml:space="preserve">User menu        </w:t>
+      </w:r>
+      <w:r>
+        <w:rPr>
+          <w:rFonts w:ascii="Segoe UI Emoji" w:hAnsi="Segoe UI Emoji" w:cs="Segoe UI Emoji"/>
+        </w:rPr>
+        <w:t>✅</w:t>
+      </w:r>
+    </w:p>
+    <w:p>
+      <w:r>
+        <w:t xml:space="preserve">Approval         </w:t>
+      </w:r>
+      <w:r>
+        <w:rPr>
+          <w:rFonts w:ascii="Segoe UI Emoji" w:hAnsi="Segoe UI Emoji" w:cs="Segoe UI Emoji"/>
+        </w:rPr>
+        <w:t>✅</w:t>
+      </w:r>
+    </w:p>
+    <w:p>
+      <w:r>
+        <w:t xml:space="preserve">Delivery         </w:t>
+      </w:r>
+      <w:r>
+        <w:rPr>
+          <w:rFonts w:ascii="Segoe UI Emoji" w:hAnsi="Segoe UI Emoji" w:cs="Segoe UI Emoji"/>
+        </w:rPr>
+        <w:t>✅</w:t>
+      </w:r>
+    </w:p>
+    <w:p>
+      <w:pPr>
+        <w:rPr>
+          <w:b/>
+          <w:bCs/>
+        </w:rPr>
+      </w:pPr>
+      <w:r>
+        <w:rPr>
+          <w:b/>
+          <w:bCs/>
+        </w:rPr>
+        <w:t>IT Admin</w:t>
+      </w:r>
+    </w:p>
+    <w:p>
+      <w:r>
+        <w:t>Login:</w:t>
+      </w:r>
+    </w:p>
+    <w:p>
+      <w:r>
+        <w:t>admin</w:t>
+      </w:r>
+    </w:p>
+    <w:p>
+      <w:r>
+        <w:lastRenderedPageBreak/>
+        <w:t>Expected:</w:t>
+      </w:r>
+    </w:p>
+    <w:p>
+      <w:r>
+        <w:t xml:space="preserve">Admin menu       </w:t>
+      </w:r>
+      <w:r>
+        <w:rPr>
+          <w:rFonts w:ascii="Segoe UI Emoji" w:hAnsi="Segoe UI Emoji" w:cs="Segoe UI Emoji"/>
+        </w:rPr>
+        <w:t>✅</w:t>
+      </w:r>
+    </w:p>
+    <w:p>
+      <w:r>
+        <w:t xml:space="preserve">User menu        </w:t>
+      </w:r>
+      <w:r>
+        <w:rPr>
+          <w:rFonts w:ascii="Segoe UI Emoji" w:hAnsi="Segoe UI Emoji" w:cs="Segoe UI Emoji"/>
+        </w:rPr>
+        <w:t>✅</w:t>
+      </w:r>
+    </w:p>
+    <w:p>
+      <w:r>
+        <w:t xml:space="preserve">Approval         </w:t>
+      </w:r>
+      <w:r>
+        <w:rPr>
+          <w:rFonts w:ascii="Segoe UI Emoji" w:hAnsi="Segoe UI Emoji" w:cs="Segoe UI Emoji"/>
+        </w:rPr>
+        <w:t>✅</w:t>
+      </w:r>
+    </w:p>
+    <w:p>
+      <w:r>
+        <w:t xml:space="preserve">Delivery         </w:t>
+      </w:r>
+      <w:r>
+        <w:rPr>
+          <w:rFonts w:ascii="Segoe UI Emoji" w:hAnsi="Segoe UI Emoji" w:cs="Segoe UI Emoji"/>
+        </w:rPr>
+        <w:t>✅</w:t>
+      </w:r>
+    </w:p>
+    <w:p>
+      <w:pPr>
+        <w:rPr>
+          <w:b/>
+          <w:bCs/>
+        </w:rPr>
+      </w:pPr>
+      <w:r>
+        <w:rPr>
+          <w:b/>
+          <w:bCs/>
+        </w:rPr>
+        <w:t>IT Personnel</w:t>
+      </w:r>
+    </w:p>
+    <w:p>
+      <w:r>
+        <w:t>Login:</w:t>
+      </w:r>
+    </w:p>
+    <w:p>
+      <w:r>
+        <w:t>test.itpersonnel</w:t>
+      </w:r>
+    </w:p>
+    <w:p>
+      <w:r>
+        <w:t>Expected:</w:t>
+      </w:r>
+    </w:p>
+    <w:p>
+      <w:r>
+        <w:t xml:space="preserve">Admin menu       </w:t>
+      </w:r>
+      <w:r>
+        <w:rPr>
+          <w:rFonts w:ascii="Segoe UI Emoji" w:hAnsi="Segoe UI Emoji" w:cs="Segoe UI Emoji"/>
+        </w:rPr>
+        <w:t>❌</w:t>
+      </w:r>
+    </w:p>
+    <w:p>
+      <w:r>
+        <w:t xml:space="preserve">User menu        </w:t>
+      </w:r>
+      <w:r>
+        <w:rPr>
+          <w:rFonts w:ascii="Segoe UI Emoji" w:hAnsi="Segoe UI Emoji" w:cs="Segoe UI Emoji"/>
+        </w:rPr>
+        <w:t>✅</w:t>
+      </w:r>
+    </w:p>
+    <w:p>
+      <w:r>
+        <w:t xml:space="preserve">Approval         </w:t>
+      </w:r>
+      <w:r>
+        <w:rPr>
+          <w:rFonts w:ascii="Segoe UI Emoji" w:hAnsi="Segoe UI Emoji" w:cs="Segoe UI Emoji"/>
+        </w:rPr>
+        <w:t>✅</w:t>
+      </w:r>
+    </w:p>
+    <w:p>
+      <w:r>
+        <w:t xml:space="preserve">Delivery         </w:t>
+      </w:r>
+      <w:r>
+        <w:rPr>
+          <w:rFonts w:ascii="Segoe UI Emoji" w:hAnsi="Segoe UI Emoji" w:cs="Segoe UI Emoji"/>
+        </w:rPr>
+        <w:t>✅</w:t>
+      </w:r>
+    </w:p>
+    <w:p>
+      <w:pPr>
+        <w:rPr>
+          <w:b/>
+          <w:bCs/>
+        </w:rPr>
+      </w:pPr>
+      <w:r>
+        <w:rPr>
+          <w:b/>
+          <w:bCs/>
+        </w:rPr>
+        <w:t>General User</w:t>
+      </w:r>
+    </w:p>
+    <w:p>
+      <w:r>
+        <w:t>Login:</w:t>
+      </w:r>
+    </w:p>
+    <w:p>
+      <w:r>
+        <w:t>test.general</w:t>
+      </w:r>
+    </w:p>
+    <w:p>
+      <w:r>
+        <w:t>Expected:</w:t>
+      </w:r>
+    </w:p>
+    <w:p>
+      <w:r>
+        <w:t xml:space="preserve">Admin menu       </w:t>
+      </w:r>
+      <w:r>
+        <w:rPr>
+          <w:rFonts w:ascii="Segoe UI Emoji" w:hAnsi="Segoe UI Emoji" w:cs="Segoe UI Emoji"/>
+        </w:rPr>
+        <w:t>❌</w:t>
+      </w:r>
+    </w:p>
+    <w:p>
+      <w:r>
+        <w:t xml:space="preserve">User menu        </w:t>
+      </w:r>
+      <w:r>
+        <w:rPr>
+          <w:rFonts w:ascii="Segoe UI Emoji" w:hAnsi="Segoe UI Emoji" w:cs="Segoe UI Emoji"/>
+        </w:rPr>
+        <w:t>✅</w:t>
+      </w:r>
+    </w:p>
+    <w:p>
+      <w:r>
+        <w:t xml:space="preserve">Approval         </w:t>
+      </w:r>
+      <w:r>
+        <w:rPr>
+          <w:rFonts w:ascii="Segoe UI Emoji" w:hAnsi="Segoe UI Emoji" w:cs="Segoe UI Emoji"/>
+        </w:rPr>
+        <w:t>❌</w:t>
+      </w:r>
+    </w:p>
+    <w:p>
+      <w:r>
+        <w:t xml:space="preserve">Delivery         </w:t>
+      </w:r>
+      <w:r>
+        <w:rPr>
+          <w:rFonts w:ascii="Segoe UI Emoji" w:hAnsi="Segoe UI Emoji" w:cs="Segoe UI Emoji"/>
+        </w:rPr>
+        <w:t>❌</w:t>
+      </w:r>
+    </w:p>
+    <w:p>
+      <w:r>
+        <w:t>And manual API attempts from General User should still return:</w:t>
+      </w:r>
+    </w:p>
+    <w:p>
+      <w:r>
+        <w:t>403 permission denied</w:t>
+      </w:r>
+    </w:p>
+    <w:p>
+      <w:r>
+        <w:pict w14:anchorId="7CC09D1D">
+          <v:rect id="_x0000_i1087" style="width:0;height:1.5pt" o:hralign="center" o:hrstd="t" o:hr="t" fillcolor="#a0a0a0" stroked="f"/>
+        </w:pict>
+      </w:r>
+    </w:p>
+    <w:p>
+      <w:pPr>
+        <w:rPr>
+          <w:b/>
+          <w:bCs/>
+        </w:rPr>
+      </w:pPr>
+      <w:r>
+        <w:rPr>
+          <w:b/>
+          <w:bCs/>
+        </w:rPr>
+        <w:t>Step 6 — Protect direct Admin URLs</w:t>
+      </w:r>
+    </w:p>
+    <w:p>
+      <w:r>
+        <w:lastRenderedPageBreak/>
+        <w:t>Hiding the sidebar alone is not sufficient UX protection.</w:t>
+      </w:r>
+    </w:p>
+    <w:p>
+      <w:r>
+        <w:t>After menu filtering works, we will add an Admin route guard so an IT Personnel or General User cannot simply type an Admin URL such as:</w:t>
+      </w:r>
+    </w:p>
+    <w:p>
+      <w:r>
+        <w:t>/dashboard/master-data</w:t>
+      </w:r>
+    </w:p>
+    <w:p>
+      <w:r>
+        <w:t>/dashboard/add_item/add_list</w:t>
+      </w:r>
+    </w:p>
+    <w:p>
+      <w:r>
+        <w:t>and see the page.</w:t>
+      </w:r>
+    </w:p>
+    <w:p>
+      <w:r>
+        <w:t>For that stage, I recommend creating:</w:t>
+      </w:r>
+    </w:p>
+    <w:p>
+      <w:r>
+        <w:t>frontend/components/auth/PermissionGuard.tsx</w:t>
+      </w:r>
+    </w:p>
+    <w:p>
+      <w:r>
+        <w:t>Then admin pages can use:</w:t>
+      </w:r>
+    </w:p>
+    <w:p>
+      <w:r>
+        <w:t>&lt;PermissionGuard permission="panel.admin.access"&gt;</w:t>
+      </w:r>
+    </w:p>
+    <w:p>
+      <w:r>
+        <w:t xml:space="preserve">    ...</w:t>
+      </w:r>
+    </w:p>
+    <w:p>
+      <w:r>
+        <w:t>&lt;/PermissionGuard&gt;</w:t>
+      </w:r>
+    </w:p>
+    <w:p>
+      <w:r>
+        <w:t>Backend authorization remains the final authority.</w:t>
+      </w:r>
+    </w:p>
+    <w:p>
+      <w:r>
+        <w:pict w14:anchorId="045861AB">
+          <v:rect id="_x0000_i1088" style="width:0;height:1.5pt" o:hralign="center" o:hrstd="t" o:hr="t" fillcolor="#a0a0a0" stroked="f"/>
+        </w:pict>
+      </w:r>
+    </w:p>
+    <w:p>
+      <w:pPr>
+        <w:rPr>
+          <w:b/>
+          <w:bCs/>
+        </w:rPr>
+      </w:pPr>
+      <w:r>
+        <w:rPr>
+          <w:b/>
+          <w:bCs/>
+        </w:rPr>
+        <w:t>Step 7 — Clean up temporary authentication data</w:t>
+      </w:r>
+    </w:p>
+    <w:p>
+      <w:r>
+        <w:t xml:space="preserve">Only </w:t>
+      </w:r>
+      <w:r>
+        <w:rPr>
+          <w:b/>
+          <w:bCs/>
+        </w:rPr>
+        <w:t>after all four frontend role tests pass</w:t>
+      </w:r>
+      <w:r>
+        <w:t>, we will handle:</w:t>
+      </w:r>
+    </w:p>
+    <w:p>
+      <w:r>
+        <w:t>TEST-IT-001</w:t>
+      </w:r>
+    </w:p>
+    <w:p>
+      <w:r>
+        <w:t>TEST-GEN-001</w:t>
+      </w:r>
+    </w:p>
+    <w:p>
+      <w:r>
+        <w:t>TEST-AUTH-001</w:t>
+      </w:r>
+    </w:p>
+    <w:p>
+      <w:r>
+        <w:t>ADMIN-001 demo account</w:t>
+      </w:r>
+    </w:p>
+    <w:p>
+      <w:r>
+        <w:t>We should not delete them yet because they are still useful for role testing.</w:t>
+      </w:r>
+    </w:p>
+    <w:p>
+      <w:r>
+        <w:pict w14:anchorId="4DA7819C">
+          <v:rect id="_x0000_i1089" style="width:0;height:1.5pt" o:hralign="center" o:hrstd="t" o:hr="t" fillcolor="#a0a0a0" stroked="f"/>
+        </w:pict>
+      </w:r>
+    </w:p>
+    <w:p>
+      <w:pPr>
+        <w:rPr>
+          <w:b/>
+          <w:bCs/>
+        </w:rPr>
+      </w:pPr>
+      <w:r>
+        <w:rPr>
+          <w:b/>
+          <w:bCs/>
+        </w:rPr>
+        <w:t>Your immediate next step</w:t>
+      </w:r>
+    </w:p>
+    <w:p>
+      <w:r>
+        <w:t>We are currently here:</w:t>
+      </w:r>
+    </w:p>
+    <w:p>
+      <w:r>
+        <w:t xml:space="preserve">Backend authorization        </w:t>
+      </w:r>
+      <w:r>
+        <w:rPr>
+          <w:rFonts w:ascii="Segoe UI Emoji" w:hAnsi="Segoe UI Emoji" w:cs="Segoe UI Emoji"/>
+        </w:rPr>
+        <w:t>✅</w:t>
+      </w:r>
+    </w:p>
+    <w:p>
+      <w:r>
+        <w:t xml:space="preserve">Login /auth/me               </w:t>
+      </w:r>
+      <w:r>
+        <w:rPr>
+          <w:rFonts w:ascii="Segoe UI Emoji" w:hAnsi="Segoe UI Emoji" w:cs="Segoe UI Emoji"/>
+        </w:rPr>
+        <w:t>✅</w:t>
+      </w:r>
+    </w:p>
+    <w:p>
+      <w:r>
+        <w:lastRenderedPageBreak/>
+        <w:t xml:space="preserve">Session validation           </w:t>
+      </w:r>
+      <w:r>
+        <w:rPr>
+          <w:rFonts w:ascii="Segoe UI Emoji" w:hAnsi="Segoe UI Emoji" w:cs="Segoe UI Emoji"/>
+        </w:rPr>
+        <w:t>✅</w:t>
+      </w:r>
+    </w:p>
+    <w:p>
+      <w:r>
+        <w:t xml:space="preserve">Smooth Logout                </w:t>
+      </w:r>
+      <w:r>
+        <w:rPr>
+          <w:rFonts w:ascii="Segoe UI Emoji" w:hAnsi="Segoe UI Emoji" w:cs="Segoe UI Emoji"/>
+        </w:rPr>
+        <w:t>✅</w:t>
+      </w:r>
+    </w:p>
+    <w:p/>
+    <w:p>
+      <w:r>
+        <w:t>→ Sidebar permissions        NEXT</w:t>
+      </w:r>
+    </w:p>
+    <w:p>
+      <w:r>
+        <w:t>→ Requisition UI permissions</w:t>
+      </w:r>
+    </w:p>
+    <w:p>
+      <w:r>
+        <w:t>→ Direct Admin URL guards</w:t>
+      </w:r>
+    </w:p>
+    <w:p>
+      <w:r>
+        <w:t>→ Header/profile identity</w:t>
+      </w:r>
+    </w:p>
+    <w:p>
+      <w:r>
+        <w:t>→ Test roles 0 / 1 / 2 / 3</w:t>
+      </w:r>
+    </w:p>
+    <w:p>
+      <w:r>
+        <w:t>→ Real employee accounts</w:t>
+      </w:r>
+    </w:p>
+    <w:p>
+      <w:r>
+        <w:t>So now send me this complete page:</w:t>
+      </w:r>
+    </w:p>
+    <w:p>
+      <w:r>
+        <w:t>frontend/components/ui/sidebar.tsx</w:t>
+      </w:r>
+    </w:p>
+    <w:p>
+      <w:r>
+        <w:t>using:</w:t>
+      </w:r>
+    </w:p>
+    <w:p>
+      <w:r>
+        <w:t>Get-Content ".\frontend\components\ui\sidebar.tsx"</w:t>
+      </w:r>
+    </w:p>
+    <w:p>
+      <w:r>
+        <w:t xml:space="preserve">Then I'll give you the </w:t>
+      </w:r>
+      <w:r>
+        <w:rPr>
+          <w:b/>
+          <w:bCs/>
+        </w:rPr>
+        <w:t>complete updated Sidebar file</w:t>
+      </w:r>
+      <w:r>
+        <w:t xml:space="preserve"> as the next implementation step.</w:t>
+      </w:r>
+    </w:p>
+    <w:p>
+      <w:pPr>
+        <w:rPr>
+          <w:vanish/>
+        </w:rPr>
+      </w:pPr>
+      <w:r>
+        <w:rPr>
+          <w:vanish/>
+        </w:rPr>
+        <w:t>Top of Form</w:t>
+      </w:r>
+    </w:p>
+    <w:p/>
+    <w:p>
+      <w:pPr>
+        <w:rPr>
+          <w:vanish/>
+        </w:rPr>
+      </w:pPr>
+      <w:r>
+        <w:rPr>
+          <w:vanish/>
+        </w:rPr>
+        <w:t>Bottom of Form</w:t>
+      </w:r>
+    </w:p>
+    <w:p>
+      <w:r>
+        <w:drawing>
+          <wp:inline distT="0" distB="0" distL="0" distR="0" wp14:anchorId="6114B363" wp14:editId="25C68077">
+            <wp:extent cx="5943600" cy="3189605"/>
+            <wp:effectExtent l="0" t="0" r="0" b="0"/>
+            <wp:docPr id="1959493904" name="Picture 1"/>
+            <wp:cNvGraphicFramePr>
+              <a:graphicFrameLocks xmlns:a="http://schemas.openxmlformats.org/drawingml/2006/main" noChangeAspect="1"/>
+            </wp:cNvGraphicFramePr>
+            <a:graphic xmlns:a="http://schemas.openxmlformats.org/drawingml/2006/main">
+              <a:graphicData uri="http://schemas.openxmlformats.org/drawingml/2006/picture">
+                <pic:pic xmlns:pic="http://schemas.openxmlformats.org/drawingml/2006/picture">
+                  <pic:nvPicPr>
+                    <pic:cNvPr id="1959493904" name=""/>
+                    <pic:cNvPicPr/>
+                  </pic:nvPicPr>
+                  <pic:blipFill>
+                    <a:blip r:embed="rId12"/>
+                    <a:stretch>
+                      <a:fillRect/>
+                    </a:stretch>
+                  </pic:blipFill>
+                  <pic:spPr>
+                    <a:xfrm>
+                      <a:off x="0" y="0"/>
+                      <a:ext cx="5943600" cy="3189605"/>
                     </a:xfrm>
                     <a:prstGeom prst="rect">
                       <a:avLst/>
@@ -3216,8 +4597,160 @@
       </w:rPr>
     </w:lvl>
   </w:abstractNum>
+  <w:abstractNum w:abstractNumId="1" w15:restartNumberingAfterBreak="0">
+    <w:nsid w:val="64112707"/>
+    <w:multiLevelType w:val="multilevel"/>
+    <w:tmpl w:val="F120FD80"/>
+    <w:lvl w:ilvl="0">
+      <w:start w:val="1"/>
+      <w:numFmt w:val="bullet"/>
+      <w:lvlText w:val=""/>
+      <w:lvlJc w:val="left"/>
+      <w:pPr>
+        <w:tabs>
+          <w:tab w:val="num" w:pos="720"/>
+        </w:tabs>
+        <w:ind w:left="720" w:hanging="360"/>
+      </w:pPr>
+      <w:rPr>
+        <w:rFonts w:ascii="Symbol" w:hAnsi="Symbol" w:hint="default"/>
+        <w:sz w:val="20"/>
+      </w:rPr>
+    </w:lvl>
+    <w:lvl w:ilvl="1" w:tentative="1">
+      <w:start w:val="1"/>
+      <w:numFmt w:val="bullet"/>
+      <w:lvlText w:val="o"/>
+      <w:lvlJc w:val="left"/>
+      <w:pPr>
+        <w:tabs>
+          <w:tab w:val="num" w:pos="1440"/>
+        </w:tabs>
+        <w:ind w:left="1440" w:hanging="360"/>
+      </w:pPr>
+      <w:rPr>
+        <w:rFonts w:ascii="Courier New" w:hAnsi="Courier New" w:hint="default"/>
+        <w:sz w:val="20"/>
+      </w:rPr>
+    </w:lvl>
+    <w:lvl w:ilvl="2" w:tentative="1">
+      <w:start w:val="1"/>
+      <w:numFmt w:val="bullet"/>
+      <w:lvlText w:val=""/>
+      <w:lvlJc w:val="left"/>
+      <w:pPr>
+        <w:tabs>
+          <w:tab w:val="num" w:pos="2160"/>
+        </w:tabs>
+        <w:ind w:left="2160" w:hanging="360"/>
+      </w:pPr>
+      <w:rPr>
+        <w:rFonts w:ascii="Wingdings" w:hAnsi="Wingdings" w:hint="default"/>
+        <w:sz w:val="20"/>
+      </w:rPr>
+    </w:lvl>
+    <w:lvl w:ilvl="3" w:tentative="1">
+      <w:start w:val="1"/>
+      <w:numFmt w:val="bullet"/>
+      <w:lvlText w:val=""/>
+      <w:lvlJc w:val="left"/>
+      <w:pPr>
+        <w:tabs>
+          <w:tab w:val="num" w:pos="2880"/>
+        </w:tabs>
+        <w:ind w:left="2880" w:hanging="360"/>
+      </w:pPr>
+      <w:rPr>
+        <w:rFonts w:ascii="Wingdings" w:hAnsi="Wingdings" w:hint="default"/>
+        <w:sz w:val="20"/>
+      </w:rPr>
+    </w:lvl>
+    <w:lvl w:ilvl="4" w:tentative="1">
+      <w:start w:val="1"/>
+      <w:numFmt w:val="bullet"/>
+      <w:lvlText w:val=""/>
+      <w:lvlJc w:val="left"/>
+      <w:pPr>
+        <w:tabs>
+          <w:tab w:val="num" w:pos="3600"/>
+        </w:tabs>
+        <w:ind w:left="3600" w:hanging="360"/>
+      </w:pPr>
+      <w:rPr>
+        <w:rFonts w:ascii="Wingdings" w:hAnsi="Wingdings" w:hint="default"/>
+        <w:sz w:val="20"/>
+      </w:rPr>
+    </w:lvl>
+    <w:lvl w:ilvl="5" w:tentative="1">
+      <w:start w:val="1"/>
+      <w:numFmt w:val="bullet"/>
+      <w:lvlText w:val=""/>
+      <w:lvlJc w:val="left"/>
+      <w:pPr>
+        <w:tabs>
+          <w:tab w:val="num" w:pos="4320"/>
+        </w:tabs>
+        <w:ind w:left="4320" w:hanging="360"/>
+      </w:pPr>
+      <w:rPr>
+        <w:rFonts w:ascii="Wingdings" w:hAnsi="Wingdings" w:hint="default"/>
+        <w:sz w:val="20"/>
+      </w:rPr>
+    </w:lvl>
+    <w:lvl w:ilvl="6" w:tentative="1">
+      <w:start w:val="1"/>
+      <w:numFmt w:val="bullet"/>
+      <w:lvlText w:val=""/>
+      <w:lvlJc w:val="left"/>
+      <w:pPr>
+        <w:tabs>
+          <w:tab w:val="num" w:pos="5040"/>
+        </w:tabs>
+        <w:ind w:left="5040" w:hanging="360"/>
+      </w:pPr>
+      <w:rPr>
+        <w:rFonts w:ascii="Wingdings" w:hAnsi="Wingdings" w:hint="default"/>
+        <w:sz w:val="20"/>
+      </w:rPr>
+    </w:lvl>
+    <w:lvl w:ilvl="7" w:tentative="1">
+      <w:start w:val="1"/>
+      <w:numFmt w:val="bullet"/>
+      <w:lvlText w:val=""/>
+      <w:lvlJc w:val="left"/>
+      <w:pPr>
+        <w:tabs>
+          <w:tab w:val="num" w:pos="5760"/>
+        </w:tabs>
+        <w:ind w:left="5760" w:hanging="360"/>
+      </w:pPr>
+      <w:rPr>
+        <w:rFonts w:ascii="Wingdings" w:hAnsi="Wingdings" w:hint="default"/>
+        <w:sz w:val="20"/>
+      </w:rPr>
+    </w:lvl>
+    <w:lvl w:ilvl="8" w:tentative="1">
+      <w:start w:val="1"/>
+      <w:numFmt w:val="bullet"/>
+      <w:lvlText w:val=""/>
+      <w:lvlJc w:val="left"/>
+      <w:pPr>
+        <w:tabs>
+          <w:tab w:val="num" w:pos="6480"/>
+        </w:tabs>
+        <w:ind w:left="6480" w:hanging="360"/>
+      </w:pPr>
+      <w:rPr>
+        <w:rFonts w:ascii="Wingdings" w:hAnsi="Wingdings" w:hint="default"/>
+        <w:sz w:val="20"/>
+      </w:rPr>
+    </w:lvl>
+  </w:abstractNum>
   <w:num w:numId="1" w16cid:durableId="447746659">
     <w:abstractNumId w:val="0"/>
+  </w:num>
+  <w:num w:numId="2" w16cid:durableId="1742605021">
+    <w:abstractNumId w:val="1"/>
   </w:num>
 </w:numbering>
 </file>

</xml_diff>